<commit_message>
docs: update project documents and remove obsolete ethics files
</commit_message>
<xml_diff>
--- a/HCI Ethics Table Template.docx
+++ b/HCI Ethics Table Template.docx
@@ -1,6 +1,6 @@
 
 <file path=word/document.xml><?xml version="1.0" encoding="utf-8"?>
-<w:document xmlns:wpc="http://schemas.microsoft.com/office/word/2010/wordprocessingCanvas" xmlns:cx="http://schemas.microsoft.com/office/drawing/2014/chartex" xmlns:cx1="http://schemas.microsoft.com/office/drawing/2015/9/8/chartex" xmlns:cx2="http://schemas.microsoft.com/office/drawing/2015/10/21/chartex" xmlns:cx3="http://schemas.microsoft.com/office/drawing/2016/5/9/chartex" xmlns:cx4="http://schemas.microsoft.com/office/drawing/2016/5/10/chartex" xmlns:cx5="http://schemas.microsoft.com/office/drawing/2016/5/11/chartex" xmlns:cx6="http://schemas.microsoft.com/office/drawing/2016/5/12/chartex" xmlns:cx7="http://schemas.microsoft.com/office/drawing/2016/5/13/chartex" xmlns:cx8="http://schemas.microsoft.com/office/drawing/2016/5/14/chartex" xmlns:mc="http://schemas.openxmlformats.org/markup-compatibility/2006" xmlns:m="http://schemas.openxmlformats.org/officeDocument/2006/math" xmlns:aink="http://schemas.microsoft.com/office/drawing/2016/ink" xmlns:am3d="http://schemas.microsoft.com/office/drawing/2017/model3d" xmlns:oel="http://schemas.microsoft.com/office/2019/extlst" xmlns:r="http://schemas.openxmlformats.org/officeDocument/2006/relationships" xmlns:wp14="http://schemas.microsoft.com/office/word/2010/wordprocessingDrawing" xmlns:wp="http://schemas.openxmlformats.org/drawingml/2006/wordprocessingDrawing" xmlns:wpg="http://schemas.microsoft.com/office/word/2010/wordprocessingGroup" xmlns:wpi="http://schemas.microsoft.com/office/word/2010/wordprocessingInk" xmlns:wps="http://schemas.microsoft.com/office/word/2010/wordprocessingShape" xmlns:o="urn:schemas-microsoft-com:office:office" xmlns:v="urn:schemas-microsoft-com:vml" xmlns:w10="urn:schemas-microsoft-com:office:word" xmlns:w="http://schemas.openxmlformats.org/wordprocessingml/2006/main" xmlns:w14="http://schemas.microsoft.com/office/word/2010/wordml" xmlns:w15="http://schemas.microsoft.com/office/word/2012/wordml" xmlns:w16cex="http://schemas.microsoft.com/office/word/2018/wordml/cex" xmlns:w16cid="http://schemas.microsoft.com/office/word/2016/wordml/cid" xmlns:w16="http://schemas.microsoft.com/office/word/2018/wordml" xmlns:w16sdtdh="http://schemas.microsoft.com/office/word/2020/wordml/sdtdatahash" xmlns:w16sdtfl="http://schemas.microsoft.com/office/word/2024/wordml/sdtformatlock" xmlns:w16se="http://schemas.microsoft.com/office/word/2015/wordml/symex" xmlns:w16du="http://schemas.microsoft.com/office/word/2023/wordml/word16du" xmlns:wne="http://schemas.microsoft.com/office/word/2006/wordml" mc:Ignorable="w14 w15 w16se w16cid w16 w16cex w16sdtdh w16sdtfl w16du wp14">
+<w:document xmlns:wpc="http://schemas.microsoft.com/office/word/2010/wordprocessingCanvas" xmlns:cx="http://schemas.microsoft.com/office/drawing/2014/chartex" xmlns:cx1="http://schemas.microsoft.com/office/drawing/2015/9/8/chartex" xmlns:cx2="http://schemas.microsoft.com/office/drawing/2015/10/21/chartex" xmlns:cx3="http://schemas.microsoft.com/office/drawing/2016/5/9/chartex" xmlns:cx4="http://schemas.microsoft.com/office/drawing/2016/5/10/chartex" xmlns:cx5="http://schemas.microsoft.com/office/drawing/2016/5/11/chartex" xmlns:cx6="http://schemas.microsoft.com/office/drawing/2016/5/12/chartex" xmlns:cx7="http://schemas.microsoft.com/office/drawing/2016/5/13/chartex" xmlns:cx8="http://schemas.microsoft.com/office/drawing/2016/5/14/chartex" xmlns:mc="http://schemas.openxmlformats.org/markup-compatibility/2006" xmlns:aink="http://schemas.microsoft.com/office/drawing/2016/ink" xmlns:am3d="http://schemas.microsoft.com/office/drawing/2017/model3d" xmlns:o="urn:schemas-microsoft-com:office:office" xmlns:oel="http://schemas.microsoft.com/office/2019/extlst" xmlns:r="http://schemas.openxmlformats.org/officeDocument/2006/relationships" xmlns:m="http://schemas.openxmlformats.org/officeDocument/2006/math" xmlns:v="urn:schemas-microsoft-com:vml" xmlns:wp14="http://schemas.microsoft.com/office/word/2010/wordprocessingDrawing" xmlns:wp="http://schemas.openxmlformats.org/drawingml/2006/wordprocessingDrawing" xmlns:w10="urn:schemas-microsoft-com:office:word" xmlns:w="http://schemas.openxmlformats.org/wordprocessingml/2006/main" xmlns:w14="http://schemas.microsoft.com/office/word/2010/wordml" xmlns:w15="http://schemas.microsoft.com/office/word/2012/wordml" xmlns:w16cex="http://schemas.microsoft.com/office/word/2018/wordml/cex" xmlns:w16cid="http://schemas.microsoft.com/office/word/2016/wordml/cid" xmlns:w16="http://schemas.microsoft.com/office/word/2018/wordml" xmlns:w16du="http://schemas.microsoft.com/office/word/2023/wordml/word16du" xmlns:w16sdtdh="http://schemas.microsoft.com/office/word/2020/wordml/sdtdatahash" xmlns:w16sdtfl="http://schemas.microsoft.com/office/word/2024/wordml/sdtformatlock" xmlns:w16se="http://schemas.microsoft.com/office/word/2015/wordml/symex" xmlns:wpg="http://schemas.microsoft.com/office/word/2010/wordprocessingGroup" xmlns:wpi="http://schemas.microsoft.com/office/word/2010/wordprocessingInk" xmlns:wne="http://schemas.microsoft.com/office/word/2006/wordml" xmlns:wps="http://schemas.microsoft.com/office/word/2010/wordprocessingShape" mc:Ignorable="w14 w15 w16se w16cid w16 w16cex w16sdtdh w16sdtfl w16du wp14">
   <w:body>
     <w:p>
       <w:r>
@@ -9,7 +9,7 @@
     </w:p>
     <w:p>
       <w:r>
-        <w:t xml:space="preserve">Group A: Eric Lu, Antony Hu, </w:t>
+        <w:t xml:space="preserve">Group A: Antony Hu, </w:t>
       </w:r>
       <w:proofErr w:type="spellStart"/>
       <w:r>
@@ -74,15 +74,7 @@
     </w:p>
     <w:p>
       <w:r>
-        <w:t xml:space="preserve">Participants will be recruited through voluntary invitations to friends or campus channels. The invitation will explain the study activities, </w:t>
-      </w:r>
-      <w:proofErr w:type="gramStart"/>
-      <w:r>
-        <w:t>Zoom</w:t>
-      </w:r>
-      <w:proofErr w:type="gramEnd"/>
-      <w:r>
-        <w:t xml:space="preserve"> recording, and expected 40-minute duration of each individual session. Participation will be voluntary, and participants may decline questions, take breaks, or withdraw without penalty.</w:t>
+        <w:t>Participants will be recruited through voluntary invitations to friends or campus channels. The invitation will explain the study activities, Zoom recording, and expected 40-minute duration of each individual session. Participation will be voluntary, and participants may decline questions, take breaks, or withdraw without penalty.</w:t>
       </w:r>
     </w:p>
     <w:p/>
@@ -104,7 +96,16 @@
     </w:p>
     <w:p>
       <w:r>
-        <w:t xml:space="preserve">The facilitator will explain that the interface is being evaluated, and that participants are not being graded on their programming ability. Participants may skip questions, take breaks, or withdraw without penalty. Prepared code examples will be used instead of personal assignments or private codebases, and informed consent will be obtained before Zoom recording and anonymized course reporting. Recordings and notes will be stored in an access-restricted team folder available only to Eric Lu, Antony Hu, and </w:t>
+        <w:t>The facilitator will explain that the interface is being evaluated, and that participants are not being graded on their programming ability. Participants may skip questions, take breaks, or withdraw without penalty. Prepared code examples will be used instead of personal assignments or private codebases, and informed consent will be obtained before Zoom recording and anonymized course reporting. Recordings and notes will be stored in an access-restricted team folder available only to Antony Hu</w:t>
+      </w:r>
+      <w:r>
+        <w:rPr>
+          <w:rFonts w:hint="eastAsia"/>
+        </w:rPr>
+        <w:t xml:space="preserve"> </w:t>
+      </w:r>
+      <w:r>
+        <w:t xml:space="preserve">and </w:t>
       </w:r>
       <w:proofErr w:type="spellStart"/>
       <w:r>
@@ -112,11 +113,11 @@
       </w:r>
       <w:proofErr w:type="spellEnd"/>
       <w:r>
-        <w:t xml:space="preserve"> Gu. Notes will use participant identifiers P1-P6, and identifying information will be removed or obscured in report </w:t>
+        <w:t xml:space="preserve"> Gu. Notes will use participant identifiers P1-P6, and identifying information will be removed or obscured in report screenshots. </w:t>
       </w:r>
       <w:r>
         <w:lastRenderedPageBreak/>
-        <w:t>screenshots. Original recordings and identifiable records will be deleted within 30 days after course grades are released.</w:t>
+        <w:t>Original recordings and identifiable records will be deleted within 30 days after course grades are released.</w:t>
       </w:r>
     </w:p>
     <w:sectPr>
@@ -130,7 +131,7 @@
 </file>
 
 <file path=word/numbering.xml><?xml version="1.0" encoding="utf-8"?>
-<w:numbering xmlns:wpc="http://schemas.microsoft.com/office/word/2010/wordprocessingCanvas" xmlns:cx="http://schemas.microsoft.com/office/drawing/2014/chartex" xmlns:cx1="http://schemas.microsoft.com/office/drawing/2015/9/8/chartex" xmlns:cx2="http://schemas.microsoft.com/office/drawing/2015/10/21/chartex" xmlns:cx3="http://schemas.microsoft.com/office/drawing/2016/5/9/chartex" xmlns:cx4="http://schemas.microsoft.com/office/drawing/2016/5/10/chartex" xmlns:cx5="http://schemas.microsoft.com/office/drawing/2016/5/11/chartex" xmlns:cx6="http://schemas.microsoft.com/office/drawing/2016/5/12/chartex" xmlns:cx7="http://schemas.microsoft.com/office/drawing/2016/5/13/chartex" xmlns:cx8="http://schemas.microsoft.com/office/drawing/2016/5/14/chartex" xmlns:mc="http://schemas.openxmlformats.org/markup-compatibility/2006" xmlns:m="http://schemas.openxmlformats.org/officeDocument/2006/math" xmlns:aink="http://schemas.microsoft.com/office/drawing/2016/ink" xmlns:am3d="http://schemas.microsoft.com/office/drawing/2017/model3d" xmlns:oel="http://schemas.microsoft.com/office/2019/extlst" xmlns:r="http://schemas.openxmlformats.org/officeDocument/2006/relationships" xmlns:wp14="http://schemas.microsoft.com/office/word/2010/wordprocessingDrawing" xmlns:wp="http://schemas.openxmlformats.org/drawingml/2006/wordprocessingDrawing" xmlns:wpg="http://schemas.microsoft.com/office/word/2010/wordprocessingGroup" xmlns:wpi="http://schemas.microsoft.com/office/word/2010/wordprocessingInk" xmlns:wps="http://schemas.microsoft.com/office/word/2010/wordprocessingShape" xmlns:o="urn:schemas-microsoft-com:office:office" xmlns:v="urn:schemas-microsoft-com:vml" xmlns:w10="urn:schemas-microsoft-com:office:word" xmlns:w="http://schemas.openxmlformats.org/wordprocessingml/2006/main" xmlns:w14="http://schemas.microsoft.com/office/word/2010/wordml" xmlns:w15="http://schemas.microsoft.com/office/word/2012/wordml" xmlns:w16cex="http://schemas.microsoft.com/office/word/2018/wordml/cex" xmlns:w16cid="http://schemas.microsoft.com/office/word/2016/wordml/cid" xmlns:w16="http://schemas.microsoft.com/office/word/2018/wordml" xmlns:w16sdtdh="http://schemas.microsoft.com/office/word/2020/wordml/sdtdatahash" xmlns:w16sdtfl="http://schemas.microsoft.com/office/word/2024/wordml/sdtformatlock" xmlns:w16se="http://schemas.microsoft.com/office/word/2015/wordml/symex" xmlns:w16du="http://schemas.microsoft.com/office/word/2023/wordml/word16du" xmlns:wne="http://schemas.microsoft.com/office/word/2006/wordml" mc:Ignorable="w14 w15 w16se w16cid w16 w16cex w16sdtdh w16sdtfl w16du wp14">
+<w:numbering xmlns:wpc="http://schemas.microsoft.com/office/word/2010/wordprocessingCanvas" xmlns:cx="http://schemas.microsoft.com/office/drawing/2014/chartex" xmlns:cx1="http://schemas.microsoft.com/office/drawing/2015/9/8/chartex" xmlns:cx2="http://schemas.microsoft.com/office/drawing/2015/10/21/chartex" xmlns:cx3="http://schemas.microsoft.com/office/drawing/2016/5/9/chartex" xmlns:cx4="http://schemas.microsoft.com/office/drawing/2016/5/10/chartex" xmlns:cx5="http://schemas.microsoft.com/office/drawing/2016/5/11/chartex" xmlns:cx6="http://schemas.microsoft.com/office/drawing/2016/5/12/chartex" xmlns:cx7="http://schemas.microsoft.com/office/drawing/2016/5/13/chartex" xmlns:cx8="http://schemas.microsoft.com/office/drawing/2016/5/14/chartex" xmlns:mc="http://schemas.openxmlformats.org/markup-compatibility/2006" xmlns:aink="http://schemas.microsoft.com/office/drawing/2016/ink" xmlns:am3d="http://schemas.microsoft.com/office/drawing/2017/model3d" xmlns:o="urn:schemas-microsoft-com:office:office" xmlns:oel="http://schemas.microsoft.com/office/2019/extlst" xmlns:r="http://schemas.openxmlformats.org/officeDocument/2006/relationships" xmlns:m="http://schemas.openxmlformats.org/officeDocument/2006/math" xmlns:v="urn:schemas-microsoft-com:vml" xmlns:wp14="http://schemas.microsoft.com/office/word/2010/wordprocessingDrawing" xmlns:wp="http://schemas.openxmlformats.org/drawingml/2006/wordprocessingDrawing" xmlns:w10="urn:schemas-microsoft-com:office:word" xmlns:w="http://schemas.openxmlformats.org/wordprocessingml/2006/main" xmlns:w14="http://schemas.microsoft.com/office/word/2010/wordml" xmlns:w15="http://schemas.microsoft.com/office/word/2012/wordml" xmlns:w16cex="http://schemas.microsoft.com/office/word/2018/wordml/cex" xmlns:w16cid="http://schemas.microsoft.com/office/word/2016/wordml/cid" xmlns:w16="http://schemas.microsoft.com/office/word/2018/wordml" xmlns:w16du="http://schemas.microsoft.com/office/word/2023/wordml/word16du" xmlns:w16sdtdh="http://schemas.microsoft.com/office/word/2020/wordml/sdtdatahash" xmlns:w16sdtfl="http://schemas.microsoft.com/office/word/2024/wordml/sdtformatlock" xmlns:w16se="http://schemas.microsoft.com/office/word/2015/wordml/symex" xmlns:wpg="http://schemas.microsoft.com/office/word/2010/wordprocessingGroup" xmlns:wpi="http://schemas.microsoft.com/office/word/2010/wordprocessingInk" xmlns:wne="http://schemas.microsoft.com/office/word/2006/wordml" xmlns:wps="http://schemas.microsoft.com/office/word/2010/wordprocessingShape" mc:Ignorable="w14 w15 w16se w16cid w16 w16cex w16sdtdh w16sdtfl w16du wp14">
   <w:abstractNum w:abstractNumId="0" w15:restartNumberingAfterBreak="0">
     <w:nsid w:val="26607996"/>
     <w:multiLevelType w:val="multilevel"/>
@@ -251,11 +252,11 @@
 </file>
 
 <file path=word/styles.xml><?xml version="1.0" encoding="utf-8"?>
-<w:styles xmlns:mc="http://schemas.openxmlformats.org/markup-compatibility/2006" xmlns:r="http://schemas.openxmlformats.org/officeDocument/2006/relationships" xmlns:w="http://schemas.openxmlformats.org/wordprocessingml/2006/main" xmlns:w14="http://schemas.microsoft.com/office/word/2010/wordml" xmlns:w15="http://schemas.microsoft.com/office/word/2012/wordml" xmlns:w16cex="http://schemas.microsoft.com/office/word/2018/wordml/cex" xmlns:w16cid="http://schemas.microsoft.com/office/word/2016/wordml/cid" xmlns:w16="http://schemas.microsoft.com/office/word/2018/wordml" xmlns:w16sdtdh="http://schemas.microsoft.com/office/word/2020/wordml/sdtdatahash" xmlns:w16sdtfl="http://schemas.microsoft.com/office/word/2024/wordml/sdtformatlock" xmlns:w16se="http://schemas.microsoft.com/office/word/2015/wordml/symex" xmlns:w16du="http://schemas.microsoft.com/office/word/2023/wordml/word16du" mc:Ignorable="w14 w15 w16se w16cid w16 w16cex w16sdtdh w16sdtfl w16du">
+<w:styles xmlns:mc="http://schemas.openxmlformats.org/markup-compatibility/2006" xmlns:r="http://schemas.openxmlformats.org/officeDocument/2006/relationships" xmlns:w="http://schemas.openxmlformats.org/wordprocessingml/2006/main" xmlns:w14="http://schemas.microsoft.com/office/word/2010/wordml" xmlns:w15="http://schemas.microsoft.com/office/word/2012/wordml" xmlns:w16cex="http://schemas.microsoft.com/office/word/2018/wordml/cex" xmlns:w16cid="http://schemas.microsoft.com/office/word/2016/wordml/cid" xmlns:w16="http://schemas.microsoft.com/office/word/2018/wordml" xmlns:w16du="http://schemas.microsoft.com/office/word/2023/wordml/word16du" xmlns:w16sdtdh="http://schemas.microsoft.com/office/word/2020/wordml/sdtdatahash" xmlns:w16sdtfl="http://schemas.microsoft.com/office/word/2024/wordml/sdtformatlock" xmlns:w16se="http://schemas.microsoft.com/office/word/2015/wordml/symex" mc:Ignorable="w14 w15 w16se w16cid w16 w16cex w16sdtdh w16sdtfl w16du">
   <w:docDefaults>
     <w:rPrDefault>
       <w:rPr>
-        <w:rFonts w:ascii="Arial" w:eastAsia="Arial" w:hAnsi="Arial" w:cs="Arial"/>
+        <w:rFonts w:ascii="Arial" w:eastAsiaTheme="minorEastAsia" w:hAnsi="Arial" w:cs="Arial"/>
         <w:sz w:val="22"/>
         <w:szCs w:val="22"/>
         <w:lang w:val="en-CA" w:eastAsia="zh-CN" w:bidi="ar-SA"/>

</xml_diff>